<commit_message>
feat: modernize web GUI with violet-orange design, add landing page, refresh screenshots and submission doc
</commit_message>
<xml_diff>
--- a/SKDMatch小队_唐志昊_SKDMatch.docx
+++ b/SKDMatch小队_唐志昊_SKDMatch.docx
@@ -27,7 +27,7 @@
           <w:color w:val="000000"/>
           <w:sz w:val="32"/>
         </w:rPr>
-        <w:t>SKDMatch — 科爱捏校内互助交流平台</w:t>
+        <w:t>SKDMatch，科爱捏校内互助交流平台</w:t>
       </w:r>
     </w:p>
     <w:p/>
@@ -80,7 +80,7 @@
           <w:color w:val="000000"/>
           <w:sz w:val="21"/>
         </w:rPr>
-        <w:t>作品名称：SKDMatch（科爱捏校内互助交流平台）</w:t>
+        <w:t>作品名称：SKDMatch，科爱捏校内互助交流平台</w:t>
       </w:r>
     </w:p>
     <w:p>
@@ -152,7 +152,7 @@
           <w:color w:val="000000"/>
           <w:sz w:val="21"/>
         </w:rPr>
-        <w:t>后端：Python 3.11+、FastAPI 0.115+、SQLAlchemy 2.0、Pydantic v2、Alembic、Celery 5.4+</w:t>
+        <w:t>后端：Python 3.12、FastAPI 0.115+、SQLAlchemy 2.0、Pydantic v2、Alembic、Celery 5.4+</w:t>
       </w:r>
     </w:p>
     <w:p>
@@ -216,7 +216,7 @@
           <w:color w:val="000000"/>
           <w:sz w:val="21"/>
         </w:rPr>
-        <w:t>Web 前端：React 18 + Vite + TypeScript + Tailwind CSS + TanStack Query + Zustand</w:t>
+        <w:t>Web 前端：React 18 + Vite + TypeScript + Tailwind CSS 3.4 + TanStack Query + Zustand</w:t>
       </w:r>
     </w:p>
     <w:p>
@@ -977,7 +977,23 @@
           <w:color w:val="000000"/>
           <w:sz w:val="21"/>
         </w:rPr>
-        <w:t>CI/CD 自动化：GitHub Actions 持续运行后端测试（69 个用例全部通过）、Web 构建、移动端类型检查与 Android APK 打包。</w:t>
+        <w:t>现代美观的 Web GUI：采用 Violet-Orange 渐变品牌色、圆角卡片、毛玻璃导航与交互动效，提升使用愉悦感。</w:t>
+      </w:r>
+    </w:p>
+    <w:p>
+      <w:pPr>
+        <w:pStyle w:val="ListBullet"/>
+        <w:spacing w:line="300" w:lineRule="auto"/>
+        <w:ind w:left="288"/>
+      </w:pPr>
+      <w:r>
+        <w:rPr>
+          <w:rFonts w:ascii="Microsoft YaHei" w:hAnsi="Microsoft YaHei" w:eastAsia="Microsoft YaHei"/>
+          <w:b w:val="0"/>
+          <w:color w:val="000000"/>
+          <w:sz w:val="21"/>
+        </w:rPr>
+        <w:t>CI/CD 自动化：GitHub Actions 持续运行后端测试、Web 构建、移动端类型检查与 Android APK 打包。</w:t>
       </w:r>
     </w:p>
     <w:p>
@@ -1885,6 +1901,38 @@
           </w:p>
         </w:tc>
       </w:tr>
+      <w:tr>
+        <w:tc>
+          <w:tcPr>
+            <w:tcW w:type="dxa" w:w="2880"/>
+          </w:tcPr>
+          <w:p>
+            <w:r>
+              <w:t>Web GUI</w:t>
+            </w:r>
+          </w:p>
+        </w:tc>
+        <w:tc>
+          <w:tcPr>
+            <w:tcW w:type="dxa" w:w="2880"/>
+          </w:tcPr>
+          <w:p>
+            <w:r>
+              <w:t>现代化视觉设计、Landing 页、响应式布局、交互动效</w:t>
+            </w:r>
+          </w:p>
+        </w:tc>
+        <w:tc>
+          <w:tcPr>
+            <w:tcW w:type="dxa" w:w="2880"/>
+          </w:tcPr>
+          <w:p>
+            <w:r>
+              <w:t>已完成</w:t>
+            </w:r>
+          </w:p>
+        </w:tc>
+      </w:tr>
     </w:tbl>
     <w:p>
       <w:pPr>
@@ -2035,7 +2083,60 @@
           <w:color w:val="000000"/>
           <w:sz w:val="21"/>
         </w:rPr>
-        <w:t>以下截图来自本地开发环境实际运行效果（后端 http://localhost:8001，Web http://localhost:5173）：</w:t>
+        <w:t>以下截图来自本地开发环境实际运行效果（后端 http://localhost:8001，Web http://localhost:5173），展示了升级后的现代 Web GUI：</w:t>
+      </w:r>
+    </w:p>
+    <w:p>
+      <w:pPr>
+        <w:jc w:val="center"/>
+      </w:pPr>
+      <w:r>
+        <w:drawing>
+          <wp:inline xmlns:a="http://schemas.openxmlformats.org/drawingml/2006/main" xmlns:pic="http://schemas.openxmlformats.org/drawingml/2006/picture">
+            <wp:extent cx="5029200" cy="3349308"/>
+            <wp:docPr id="1" name="Picture 1"/>
+            <wp:cNvGraphicFramePr>
+              <a:graphicFrameLocks noChangeAspect="1"/>
+            </wp:cNvGraphicFramePr>
+            <a:graphic>
+              <a:graphicData uri="http://schemas.openxmlformats.org/drawingml/2006/picture">
+                <pic:pic>
+                  <pic:nvPicPr>
+                    <pic:cNvPr id="0" name="landing.png"/>
+                    <pic:cNvPicPr/>
+                  </pic:nvPicPr>
+                  <pic:blipFill>
+                    <a:blip r:embed="rId9"/>
+                    <a:stretch>
+                      <a:fillRect/>
+                    </a:stretch>
+                  </pic:blipFill>
+                  <pic:spPr>
+                    <a:xfrm>
+                      <a:off x="0" y="0"/>
+                      <a:ext cx="5029200" cy="3349308"/>
+                    </a:xfrm>
+                    <a:prstGeom prst="rect"/>
+                  </pic:spPr>
+                </pic:pic>
+              </a:graphicData>
+            </a:graphic>
+          </wp:inline>
+        </w:drawing>
+      </w:r>
+    </w:p>
+    <w:p>
+      <w:pPr>
+        <w:jc w:val="center"/>
+      </w:pPr>
+      <w:r>
+        <w:rPr>
+          <w:rFonts w:ascii="Microsoft YaHei" w:hAnsi="Microsoft YaHei" w:eastAsia="Microsoft YaHei"/>
+          <w:b w:val="0"/>
+          <w:color w:val="666666"/>
+          <w:sz w:val="18"/>
+        </w:rPr>
+        <w:t>图 1 SKDMatch 品牌落地页</w:t>
       </w:r>
     </w:p>
     <w:p>
@@ -2046,7 +2147,7 @@
         <w:drawing>
           <wp:inline xmlns:a="http://schemas.openxmlformats.org/drawingml/2006/main" xmlns:pic="http://schemas.openxmlformats.org/drawingml/2006/picture">
             <wp:extent cx="5029200" cy="3143250"/>
-            <wp:docPr id="1" name="Picture 1"/>
+            <wp:docPr id="2" name="Picture 2"/>
             <wp:cNvGraphicFramePr>
               <a:graphicFrameLocks noChangeAspect="1"/>
             </wp:cNvGraphicFramePr>
@@ -2058,7 +2159,7 @@
                     <pic:cNvPicPr/>
                   </pic:nvPicPr>
                   <pic:blipFill>
-                    <a:blip r:embed="rId9"/>
+                    <a:blip r:embed="rId10"/>
                     <a:stretch>
                       <a:fillRect/>
                     </a:stretch>
@@ -2088,7 +2189,7 @@
           <w:color w:val="666666"/>
           <w:sz w:val="18"/>
         </w:rPr>
-        <w:t>图 3 登录页</w:t>
+        <w:t>图 2 登录页</w:t>
       </w:r>
     </w:p>
     <w:p>
@@ -2099,7 +2200,7 @@
         <w:drawing>
           <wp:inline xmlns:a="http://schemas.openxmlformats.org/drawingml/2006/main" xmlns:pic="http://schemas.openxmlformats.org/drawingml/2006/picture">
             <wp:extent cx="5029200" cy="3143250"/>
-            <wp:docPr id="2" name="Picture 2"/>
+            <wp:docPr id="3" name="Picture 3"/>
             <wp:cNvGraphicFramePr>
               <a:graphicFrameLocks noChangeAspect="1"/>
             </wp:cNvGraphicFramePr>
@@ -2111,7 +2212,7 @@
                     <pic:cNvPicPr/>
                   </pic:nvPicPr>
                   <pic:blipFill>
-                    <a:blip r:embed="rId9"/>
+                    <a:blip r:embed="rId10"/>
                     <a:stretch>
                       <a:fillRect/>
                     </a:stretch>
@@ -2141,7 +2242,7 @@
           <w:color w:val="666666"/>
           <w:sz w:val="18"/>
         </w:rPr>
-        <w:t>图 4 注册页</w:t>
+        <w:t>图 3 注册页</w:t>
       </w:r>
     </w:p>
     <w:p>
@@ -2151,8 +2252,8 @@
       <w:r>
         <w:drawing>
           <wp:inline xmlns:a="http://schemas.openxmlformats.org/drawingml/2006/main" xmlns:pic="http://schemas.openxmlformats.org/drawingml/2006/picture">
-            <wp:extent cx="5029200" cy="3307398"/>
-            <wp:docPr id="3" name="Picture 3"/>
+            <wp:extent cx="5029200" cy="3709035"/>
+            <wp:docPr id="4" name="Picture 4"/>
             <wp:cNvGraphicFramePr>
               <a:graphicFrameLocks noChangeAspect="1"/>
             </wp:cNvGraphicFramePr>
@@ -2164,7 +2265,7 @@
                     <pic:cNvPicPr/>
                   </pic:nvPicPr>
                   <pic:blipFill>
-                    <a:blip r:embed="rId10"/>
+                    <a:blip r:embed="rId11"/>
                     <a:stretch>
                       <a:fillRect/>
                     </a:stretch>
@@ -2172,7 +2273,7 @@
                   <pic:spPr>
                     <a:xfrm>
                       <a:off x="0" y="0"/>
-                      <a:ext cx="5029200" cy="3307398"/>
+                      <a:ext cx="5029200" cy="3709035"/>
                     </a:xfrm>
                     <a:prstGeom prst="rect"/>
                   </pic:spPr>
@@ -2194,7 +2295,7 @@
           <w:color w:val="666666"/>
           <w:sz w:val="18"/>
         </w:rPr>
-        <w:t>图 5 学术板块发现与推荐列表</w:t>
+        <w:t>图 4 学术板块发现与推荐列表</w:t>
       </w:r>
     </w:p>
     <w:p>
@@ -2204,8 +2305,8 @@
       <w:r>
         <w:drawing>
           <wp:inline xmlns:a="http://schemas.openxmlformats.org/drawingml/2006/main" xmlns:pic="http://schemas.openxmlformats.org/drawingml/2006/picture">
-            <wp:extent cx="5029200" cy="3143250"/>
-            <wp:docPr id="4" name="Picture 4"/>
+            <wp:extent cx="5029200" cy="3457575"/>
+            <wp:docPr id="5" name="Picture 5"/>
             <wp:cNvGraphicFramePr>
               <a:graphicFrameLocks noChangeAspect="1"/>
             </wp:cNvGraphicFramePr>
@@ -2213,11 +2314,11 @@
               <a:graphicData uri="http://schemas.openxmlformats.org/drawingml/2006/picture">
                 <pic:pic>
                   <pic:nvPicPr>
-                    <pic:cNvPr id="0" name="questionnaire_basic.png"/>
+                    <pic:cNvPr id="0" name="discovery_daily.png"/>
                     <pic:cNvPicPr/>
                   </pic:nvPicPr>
                   <pic:blipFill>
-                    <a:blip r:embed="rId11"/>
+                    <a:blip r:embed="rId12"/>
                     <a:stretch>
                       <a:fillRect/>
                     </a:stretch>
@@ -2225,7 +2326,7 @@
                   <pic:spPr>
                     <a:xfrm>
                       <a:off x="0" y="0"/>
-                      <a:ext cx="5029200" cy="3143250"/>
+                      <a:ext cx="5029200" cy="3457575"/>
                     </a:xfrm>
                     <a:prstGeom prst="rect"/>
                   </pic:spPr>
@@ -2247,7 +2348,7 @@
           <w:color w:val="666666"/>
           <w:sz w:val="18"/>
         </w:rPr>
-        <w:t>图 6 基础资料问卷填写页</w:t>
+        <w:t>图 5 日常生活板块发现页</w:t>
       </w:r>
     </w:p>
     <w:p>
@@ -2257,8 +2358,8 @@
       <w:r>
         <w:drawing>
           <wp:inline xmlns:a="http://schemas.openxmlformats.org/drawingml/2006/main" xmlns:pic="http://schemas.openxmlformats.org/drawingml/2006/picture">
-            <wp:extent cx="5029200" cy="3143250"/>
-            <wp:docPr id="5" name="Picture 5"/>
+            <wp:extent cx="5029200" cy="3709035"/>
+            <wp:docPr id="6" name="Picture 6"/>
             <wp:cNvGraphicFramePr>
               <a:graphicFrameLocks noChangeAspect="1"/>
             </wp:cNvGraphicFramePr>
@@ -2266,11 +2367,11 @@
               <a:graphicData uri="http://schemas.openxmlformats.org/drawingml/2006/picture">
                 <pic:pic>
                   <pic:nvPicPr>
-                    <pic:cNvPr id="0" name="profile.png"/>
+                    <pic:cNvPr id="0" name="discovery_dating.png"/>
                     <pic:cNvPicPr/>
                   </pic:nvPicPr>
                   <pic:blipFill>
-                    <a:blip r:embed="rId12"/>
+                    <a:blip r:embed="rId13"/>
                     <a:stretch>
                       <a:fillRect/>
                     </a:stretch>
@@ -2278,7 +2379,7 @@
                   <pic:spPr>
                     <a:xfrm>
                       <a:off x="0" y="0"/>
-                      <a:ext cx="5029200" cy="3143250"/>
+                      <a:ext cx="5029200" cy="3709035"/>
                     </a:xfrm>
                     <a:prstGeom prst="rect"/>
                   </pic:spPr>
@@ -2300,60 +2401,7 @@
           <w:color w:val="666666"/>
           <w:sz w:val="18"/>
         </w:rPr>
-        <w:t>图 7 个人资料页（含邀请码与邀请链接）</w:t>
-      </w:r>
-    </w:p>
-    <w:p>
-      <w:pPr>
-        <w:jc w:val="center"/>
-      </w:pPr>
-      <w:r>
-        <w:drawing>
-          <wp:inline xmlns:a="http://schemas.openxmlformats.org/drawingml/2006/main" xmlns:pic="http://schemas.openxmlformats.org/drawingml/2006/picture">
-            <wp:extent cx="5029200" cy="3143250"/>
-            <wp:docPr id="6" name="Picture 6"/>
-            <wp:cNvGraphicFramePr>
-              <a:graphicFrameLocks noChangeAspect="1"/>
-            </wp:cNvGraphicFramePr>
-            <a:graphic>
-              <a:graphicData uri="http://schemas.openxmlformats.org/drawingml/2006/picture">
-                <pic:pic>
-                  <pic:nvPicPr>
-                    <pic:cNvPr id="0" name="friends.png"/>
-                    <pic:cNvPicPr/>
-                  </pic:nvPicPr>
-                  <pic:blipFill>
-                    <a:blip r:embed="rId13"/>
-                    <a:stretch>
-                      <a:fillRect/>
-                    </a:stretch>
-                  </pic:blipFill>
-                  <pic:spPr>
-                    <a:xfrm>
-                      <a:off x="0" y="0"/>
-                      <a:ext cx="5029200" cy="3143250"/>
-                    </a:xfrm>
-                    <a:prstGeom prst="rect"/>
-                  </pic:spPr>
-                </pic:pic>
-              </a:graphicData>
-            </a:graphic>
-          </wp:inline>
-        </w:drawing>
-      </w:r>
-    </w:p>
-    <w:p>
-      <w:pPr>
-        <w:jc w:val="center"/>
-      </w:pPr>
-      <w:r>
-        <w:rPr>
-          <w:rFonts w:ascii="Microsoft YaHei" w:hAnsi="Microsoft YaHei" w:eastAsia="Microsoft YaHei"/>
-          <w:b w:val="0"/>
-          <w:color w:val="666666"/>
-          <w:sz w:val="18"/>
-        </w:rPr>
-        <w:t>图 8 好友列表页</w:t>
+        <w:t>图 6 恋爱交友板块发现页</w:t>
       </w:r>
     </w:p>
     <w:p>
@@ -2372,7 +2420,7 @@
               <a:graphicData uri="http://schemas.openxmlformats.org/drawingml/2006/picture">
                 <pic:pic>
                   <pic:nvPicPr>
-                    <pic:cNvPr id="0" name="chat.png"/>
+                    <pic:cNvPr id="0" name="user_detail.png"/>
                     <pic:cNvPicPr/>
                   </pic:nvPicPr>
                   <pic:blipFill>
@@ -2406,7 +2454,219 @@
           <w:color w:val="666666"/>
           <w:sz w:val="18"/>
         </w:rPr>
-        <w:t>图 9 即时聊天页（显示历史消息与发送框）</w:t>
+        <w:t>图 7 用户详情页</w:t>
+      </w:r>
+    </w:p>
+    <w:p>
+      <w:pPr>
+        <w:jc w:val="center"/>
+      </w:pPr>
+      <w:r>
+        <w:drawing>
+          <wp:inline xmlns:a="http://schemas.openxmlformats.org/drawingml/2006/main" xmlns:pic="http://schemas.openxmlformats.org/drawingml/2006/picture">
+            <wp:extent cx="5029200" cy="6607810"/>
+            <wp:docPr id="8" name="Picture 8"/>
+            <wp:cNvGraphicFramePr>
+              <a:graphicFrameLocks noChangeAspect="1"/>
+            </wp:cNvGraphicFramePr>
+            <a:graphic>
+              <a:graphicData uri="http://schemas.openxmlformats.org/drawingml/2006/picture">
+                <pic:pic>
+                  <pic:nvPicPr>
+                    <pic:cNvPr id="0" name="questionnaire_basic.png"/>
+                    <pic:cNvPicPr/>
+                  </pic:nvPicPr>
+                  <pic:blipFill>
+                    <a:blip r:embed="rId15"/>
+                    <a:stretch>
+                      <a:fillRect/>
+                    </a:stretch>
+                  </pic:blipFill>
+                  <pic:spPr>
+                    <a:xfrm>
+                      <a:off x="0" y="0"/>
+                      <a:ext cx="5029200" cy="6607810"/>
+                    </a:xfrm>
+                    <a:prstGeom prst="rect"/>
+                  </pic:spPr>
+                </pic:pic>
+              </a:graphicData>
+            </a:graphic>
+          </wp:inline>
+        </w:drawing>
+      </w:r>
+    </w:p>
+    <w:p>
+      <w:pPr>
+        <w:jc w:val="center"/>
+      </w:pPr>
+      <w:r>
+        <w:rPr>
+          <w:rFonts w:ascii="Microsoft YaHei" w:hAnsi="Microsoft YaHei" w:eastAsia="Microsoft YaHei"/>
+          <w:b w:val="0"/>
+          <w:color w:val="666666"/>
+          <w:sz w:val="18"/>
+        </w:rPr>
+        <w:t>图 8 基础资料问卷填写页</w:t>
+      </w:r>
+    </w:p>
+    <w:p>
+      <w:pPr>
+        <w:jc w:val="center"/>
+      </w:pPr>
+      <w:r>
+        <w:drawing>
+          <wp:inline xmlns:a="http://schemas.openxmlformats.org/drawingml/2006/main" xmlns:pic="http://schemas.openxmlformats.org/drawingml/2006/picture">
+            <wp:extent cx="5029200" cy="7051358"/>
+            <wp:docPr id="9" name="Picture 9"/>
+            <wp:cNvGraphicFramePr>
+              <a:graphicFrameLocks noChangeAspect="1"/>
+            </wp:cNvGraphicFramePr>
+            <a:graphic>
+              <a:graphicData uri="http://schemas.openxmlformats.org/drawingml/2006/picture">
+                <pic:pic>
+                  <pic:nvPicPr>
+                    <pic:cNvPr id="0" name="profile.png"/>
+                    <pic:cNvPicPr/>
+                  </pic:nvPicPr>
+                  <pic:blipFill>
+                    <a:blip r:embed="rId16"/>
+                    <a:stretch>
+                      <a:fillRect/>
+                    </a:stretch>
+                  </pic:blipFill>
+                  <pic:spPr>
+                    <a:xfrm>
+                      <a:off x="0" y="0"/>
+                      <a:ext cx="5029200" cy="7051358"/>
+                    </a:xfrm>
+                    <a:prstGeom prst="rect"/>
+                  </pic:spPr>
+                </pic:pic>
+              </a:graphicData>
+            </a:graphic>
+          </wp:inline>
+        </w:drawing>
+      </w:r>
+    </w:p>
+    <w:p>
+      <w:pPr>
+        <w:jc w:val="center"/>
+      </w:pPr>
+      <w:r>
+        <w:rPr>
+          <w:rFonts w:ascii="Microsoft YaHei" w:hAnsi="Microsoft YaHei" w:eastAsia="Microsoft YaHei"/>
+          <w:b w:val="0"/>
+          <w:color w:val="666666"/>
+          <w:sz w:val="18"/>
+        </w:rPr>
+        <w:t>图 9 个人资料页（含问卷入口、资料编辑与邀请码）</w:t>
+      </w:r>
+    </w:p>
+    <w:p>
+      <w:pPr>
+        <w:jc w:val="center"/>
+      </w:pPr>
+      <w:r>
+        <w:drawing>
+          <wp:inline xmlns:a="http://schemas.openxmlformats.org/drawingml/2006/main" xmlns:pic="http://schemas.openxmlformats.org/drawingml/2006/picture">
+            <wp:extent cx="5029200" cy="3143250"/>
+            <wp:docPr id="10" name="Picture 10"/>
+            <wp:cNvGraphicFramePr>
+              <a:graphicFrameLocks noChangeAspect="1"/>
+            </wp:cNvGraphicFramePr>
+            <a:graphic>
+              <a:graphicData uri="http://schemas.openxmlformats.org/drawingml/2006/picture">
+                <pic:pic>
+                  <pic:nvPicPr>
+                    <pic:cNvPr id="0" name="friends.png"/>
+                    <pic:cNvPicPr/>
+                  </pic:nvPicPr>
+                  <pic:blipFill>
+                    <a:blip r:embed="rId17"/>
+                    <a:stretch>
+                      <a:fillRect/>
+                    </a:stretch>
+                  </pic:blipFill>
+                  <pic:spPr>
+                    <a:xfrm>
+                      <a:off x="0" y="0"/>
+                      <a:ext cx="5029200" cy="3143250"/>
+                    </a:xfrm>
+                    <a:prstGeom prst="rect"/>
+                  </pic:spPr>
+                </pic:pic>
+              </a:graphicData>
+            </a:graphic>
+          </wp:inline>
+        </w:drawing>
+      </w:r>
+    </w:p>
+    <w:p>
+      <w:pPr>
+        <w:jc w:val="center"/>
+      </w:pPr>
+      <w:r>
+        <w:rPr>
+          <w:rFonts w:ascii="Microsoft YaHei" w:hAnsi="Microsoft YaHei" w:eastAsia="Microsoft YaHei"/>
+          <w:b w:val="0"/>
+          <w:color w:val="666666"/>
+          <w:sz w:val="18"/>
+        </w:rPr>
+        <w:t>图 10 好友列表页</w:t>
+      </w:r>
+    </w:p>
+    <w:p>
+      <w:pPr>
+        <w:jc w:val="center"/>
+      </w:pPr>
+      <w:r>
+        <w:drawing>
+          <wp:inline xmlns:a="http://schemas.openxmlformats.org/drawingml/2006/main" xmlns:pic="http://schemas.openxmlformats.org/drawingml/2006/picture">
+            <wp:extent cx="5029200" cy="3213100"/>
+            <wp:docPr id="11" name="Picture 11"/>
+            <wp:cNvGraphicFramePr>
+              <a:graphicFrameLocks noChangeAspect="1"/>
+            </wp:cNvGraphicFramePr>
+            <a:graphic>
+              <a:graphicData uri="http://schemas.openxmlformats.org/drawingml/2006/picture">
+                <pic:pic>
+                  <pic:nvPicPr>
+                    <pic:cNvPr id="0" name="chat.png"/>
+                    <pic:cNvPicPr/>
+                  </pic:nvPicPr>
+                  <pic:blipFill>
+                    <a:blip r:embed="rId18"/>
+                    <a:stretch>
+                      <a:fillRect/>
+                    </a:stretch>
+                  </pic:blipFill>
+                  <pic:spPr>
+                    <a:xfrm>
+                      <a:off x="0" y="0"/>
+                      <a:ext cx="5029200" cy="3213100"/>
+                    </a:xfrm>
+                    <a:prstGeom prst="rect"/>
+                  </pic:spPr>
+                </pic:pic>
+              </a:graphicData>
+            </a:graphic>
+          </wp:inline>
+        </w:drawing>
+      </w:r>
+    </w:p>
+    <w:p>
+      <w:pPr>
+        <w:jc w:val="center"/>
+      </w:pPr>
+      <w:r>
+        <w:rPr>
+          <w:rFonts w:ascii="Microsoft YaHei" w:hAnsi="Microsoft YaHei" w:eastAsia="Microsoft YaHei"/>
+          <w:b w:val="0"/>
+          <w:color w:val="666666"/>
+          <w:sz w:val="18"/>
+        </w:rPr>
+        <w:t>图 11 即时聊天页（显示历史消息与发送框）</w:t>
       </w:r>
     </w:p>
     <w:p>
@@ -2608,7 +2868,7 @@
           <w:color w:val="000000"/>
           <w:sz w:val="21"/>
         </w:rPr>
-        <w:t>唐志昊：负责整体技术方案与系统架构设计；完成后端核心模块（认证、资料、推荐、审核、问卷、AI 网关）的开发与集成；搭建 GitHub Actions CI/CD 并维护 69 个自动化测试；实现 Two-Tower 推荐 scorer、MMR 多样性重排、BPR pairwise 训练与本地 QLoRA 微调流水线。</w:t>
+        <w:t>唐志昊：负责整体技术方案与系统架构设计；完成后端核心模块（认证、资料、推荐、审核、问卷、AI 网关）的开发与集成；搭建 GitHub Actions CI/CD 并维护自动化测试；实现 Two-Tower 推荐 scorer、MMR 多样性重排、BPR pairwise 训练与本地 QLoRA 微调流水线；主导 Web 前端视觉升级与 Landing 页实现。</w:t>
       </w:r>
     </w:p>
     <w:p>

</xml_diff>